<commit_message>
Rename affiliation to "Haebom Data Inc." in submission package
Author-requested affiliation spelling change (Haebomdata Inc. -> Haebom
Data Inc.) across the MDPI submission. Fixed at the source: the affiliation
and acknowledgments blocks are injected by convert_to_mdpi.py, so editing
draft_mdpi.md alone would be overwritten on the next regen. Updated the
converter, cover letter, and submission guide, then regenerated
draft_mdpi.md and rebuilt draft_mdpi.docx (line numbers preserved),
draft_mdpi.pdf, and cover_letter_mdpi.pdf. Email domain (haebomdata.com)
left unchanged — only the displayed company name was renamed.

Co-Authored-By: Claude Opus 4.8 (1M context) <noreply@anthropic.com>
</commit_message>
<xml_diff>
--- a/manuscript/draft_mdpi.docx
+++ b/manuscript/draft_mdpi.docx
@@ -255,7 +255,7 @@
         <w:t xml:space="preserve"> </w:t>
       </w:r>
       <w:r>
-        <w:t xml:space="preserve">Haebomdata Inc., #904, Gasan A1 Tower, 205-27 Gasan 1-ro, Geumcheon-gu, Seoul 08503, Republic of Korea; tysong@haebomdata.com (T.S.); mirinae@haebomdata.com (M.K.)</w:t>
+        <w:t xml:space="preserve">Haebom Data Inc., #904, Gasan A1 Tower, 205-27 Gasan 1-ro, Geumcheon-gu, Seoul 08503, Republic of Korea; tysong@haebomdata.com (T.S.); mirinae@haebomdata.com (M.K.)</w:t>
       </w:r>
       <w:r>
         <w:br/>
@@ -17134,7 +17134,7 @@
         <w:t xml:space="preserve"> </w:t>
       </w:r>
       <w:r>
-        <w:t xml:space="preserve">Haebomdata Inc. has carried out the nationwide Blue Carbon Monitoring service</w:t>
+        <w:t xml:space="preserve">Haebom Data Inc. has carried out the nationwide Blue Carbon Monitoring service</w:t>
       </w:r>
       <w:r>
         <w:t xml:space="preserve"> </w:t>

</xml_diff>

<commit_message>
Declare KOEM 2026 Blue Carbon Monitoring funding; align COI
The 2026 National Blue Carbon Monitoring project (commissioned by KOEM,
contract R26TA01845857-00) supported this research, so it must be declared
as funding rather than acknowledged informally. Funding section now states
the project and contract number (was "no external funding"). Conflicts of
Interest reworded for consistency: the study was undertaken within that
programme (not "independently of" it), with the standard funder-no-role
affirmation retained. Acknowledgments stays free of the KOEM line (funding
belongs in Funding, the relationship in COI).

Regenerated draft_mdpi.md and rebuilt all four artifacts (draft_mdpi.docx,
draft_mdpi_styled.docx, draft_mdpi.pdf, LaTeX remotesensing.pdf); contract
number and funder-no-role text verified present in each.

Co-Authored-By: Claude Opus 4.8 (1M context) <noreply@anthropic.com>
</commit_message>
<xml_diff>
--- a/manuscript/draft_mdpi.docx
+++ b/manuscript/draft_mdpi.docx
@@ -16963,7 +16963,29 @@
         <w:pStyle w:val="FirstParagraph"/>
       </w:pPr>
       <w:r>
-        <w:t xml:space="preserve">This research received no external funding.</w:t>
+        <w:t xml:space="preserve">This research was supported by the</w:t>
+      </w:r>
+      <w:r>
+        <w:t xml:space="preserve"> </w:t>
+      </w:r>
+      <w:r>
+        <w:rPr>
+          <w:i/>
+          <w:iCs/>
+        </w:rPr>
+        <w:t xml:space="preserve">2026 National Blue Carbon Monitoring</w:t>
+      </w:r>
+      <w:r>
+        <w:t xml:space="preserve"> </w:t>
+      </w:r>
+      <w:r>
+        <w:t xml:space="preserve">project commissioned by the Korea Marine Environment Management Corporation</w:t>
+      </w:r>
+      <w:r>
+        <w:t xml:space="preserve"> </w:t>
+      </w:r>
+      <w:r>
+        <w:t xml:space="preserve">(KOEM) (contract number R26TA01845857-00).</w:t>
       </w:r>
     </w:p>
     <w:bookmarkEnd w:id="69"/>
@@ -17182,43 +17204,37 @@
         <w:pStyle w:val="FirstParagraph"/>
       </w:pPr>
       <w:r>
-        <w:t xml:space="preserve">The authors are employees of Haebom Data Inc., a company providing coastal and</w:t>
-      </w:r>
-      <w:r>
-        <w:t xml:space="preserve"> </w:t>
-      </w:r>
-      <w:r>
-        <w:t xml:space="preserve">marine geospatial data-analytics services, including the nationwide Blue Carbon</w:t>
-      </w:r>
-      <w:r>
-        <w:t xml:space="preserve"> </w:t>
-      </w:r>
-      <w:r>
-        <w:t xml:space="preserve">Monitoring service commissioned by the Korea Marine Environment Management</w:t>
-      </w:r>
-      <w:r>
-        <w:t xml:space="preserve"> </w:t>
-      </w:r>
-      <w:r>
-        <w:t xml:space="preserve">Corporation (KOEM). This study was conceived and conducted independently of that</w:t>
-      </w:r>
-      <w:r>
-        <w:t xml:space="preserve"> </w:t>
-      </w:r>
-      <w:r>
-        <w:t xml:space="preserve">service contract; Haebom Data Inc. and KOEM had no role in the design of the</w:t>
-      </w:r>
-      <w:r>
-        <w:t xml:space="preserve"> </w:t>
-      </w:r>
-      <w:r>
-        <w:t xml:space="preserve">study; in the collection, analysis, or interpretation of data; in the writing of</w:t>
-      </w:r>
-      <w:r>
-        <w:t xml:space="preserve"> </w:t>
-      </w:r>
-      <w:r>
-        <w:t xml:space="preserve">the manuscript; or in the decision to publish the results. The authors declare no</w:t>
+        <w:t xml:space="preserve">Both authors are employees of Haebom Data Inc., which carries out the 2026</w:t>
+      </w:r>
+      <w:r>
+        <w:t xml:space="preserve"> </w:t>
+      </w:r>
+      <w:r>
+        <w:t xml:space="preserve">National Blue Carbon Monitoring service commissioned by the Korea Marine</w:t>
+      </w:r>
+      <w:r>
+        <w:t xml:space="preserve"> </w:t>
+      </w:r>
+      <w:r>
+        <w:t xml:space="preserve">Environment Management Corporation (KOEM); the present study was undertaken</w:t>
+      </w:r>
+      <w:r>
+        <w:t xml:space="preserve"> </w:t>
+      </w:r>
+      <w:r>
+        <w:t xml:space="preserve">within that programme. The funder had no role in the design of the study; in the</w:t>
+      </w:r>
+      <w:r>
+        <w:t xml:space="preserve"> </w:t>
+      </w:r>
+      <w:r>
+        <w:t xml:space="preserve">collection, analyses, or interpretation of data; in the writing of the</w:t>
+      </w:r>
+      <w:r>
+        <w:t xml:space="preserve"> </w:t>
+      </w:r>
+      <w:r>
+        <w:t xml:space="preserve">manuscript; or in the decision to publish the results. The authors declare no</w:t>
       </w:r>
       <w:r>
         <w:t xml:space="preserve"> </w:t>

</xml_diff>

<commit_message>
Add Inha University as Taeyoon Song's second affiliation
T.S. is also a Ph.D. candidate at Inha University, so he now carries two
affiliations: [1] Haebom Data Inc. and [2] Department of Ocean Sciences,
Inha University, Incheon. Updated the author byline superscript (1 -> 1,2),
the affiliation block (convert_to_mdpi.py), the LaTeX \Author/\address
(build_latex_mdpi.py), and the submission guide. M.K. stays affiliation 1.

Regenerated draft_mdpi.md and rebuilt all four artifacts; the second
affiliation and the 1,2 superscript verified present (LaTeX page 1 renders
"Taeyoon Song 1,2,* and Mirinae Kim 1" with both addresses).

Co-Authored-By: Claude Opus 4.8 (1M context) <noreply@anthropic.com>
</commit_message>
<xml_diff>
--- a/manuscript/draft_mdpi.docx
+++ b/manuscript/draft_mdpi.docx
@@ -21,7 +21,7 @@
         <w:rPr>
           <w:vertAlign w:val="superscript"/>
         </w:rPr>
-        <w:t xml:space="preserve">1</w:t>
+        <w:t xml:space="preserve">1,2</w:t>
       </w:r>
       <w:r>
         <w:t xml:space="preserve">, Mirinae Kim</w:t>
@@ -256,6 +256,21 @@
       </w:r>
       <w:r>
         <w:t xml:space="preserve">Haebom Data Inc., #904, Gasan A1 Tower, 205-27 Gasan 1-ro, Geumcheon-gu, Seoul 08503, Republic of Korea; tysong@haebomdata.com (T.S.); mirinae@haebomdata.com (M.K.)</w:t>
+      </w:r>
+      <w:r>
+        <w:br/>
+      </w:r>
+      <w:r>
+        <w:rPr>
+          <w:vertAlign w:val="superscript"/>
+        </w:rPr>
+        <w:t xml:space="preserve">2</w:t>
+      </w:r>
+      <w:r>
+        <w:t xml:space="preserve"> </w:t>
+      </w:r>
+      <w:r>
+        <w:t xml:space="preserve">Department of Ocean Sciences, Inha University, Incheon 22212, Republic of Korea</w:t>
       </w:r>
       <w:r>
         <w:br/>

</xml_diff>

<commit_message>
Reorder T.S. affiliations: Inha University primary, Haebom Data Inc. second
Per author request, Taeyoon Song's primary affiliation is now [1] Department
of Ocean Sciences, Inha University, with [2] Haebom Data Inc. second.
Affiliations renumber by first appearance, so M.K. moves to [2] (Haebom).
Byline superscripts: T.S. 1,2 / M.K. 2. Updated draft.md byline,
convert_to_mdpi.py affiliation block, LaTeX \Author/\address, and the
submission guide; rebuilt all four artifacts (LaTeX page 1 renders
"Taeyoon Song 1,2,* and Mirinae Kim 2" with Inha as affiliation 1).

Co-Authored-By: Claude Opus 4.8 (1M context) <noreply@anthropic.com>
</commit_message>
<xml_diff>
--- a/manuscript/draft_mdpi.docx
+++ b/manuscript/draft_mdpi.docx
@@ -30,7 +30,7 @@
         <w:rPr>
           <w:vertAlign w:val="superscript"/>
         </w:rPr>
-        <w:t xml:space="preserve">1</w:t>
+        <w:t xml:space="preserve">2</w:t>
       </w:r>
     </w:p>
     <w:p>
@@ -255,22 +255,22 @@
         <w:t xml:space="preserve"> </w:t>
       </w:r>
       <w:r>
+        <w:t xml:space="preserve">Department of Ocean Sciences, Inha University, Incheon 22212, Republic of Korea</w:t>
+      </w:r>
+      <w:r>
+        <w:br/>
+      </w:r>
+      <w:r>
+        <w:rPr>
+          <w:vertAlign w:val="superscript"/>
+        </w:rPr>
+        <w:t xml:space="preserve">2</w:t>
+      </w:r>
+      <w:r>
+        <w:t xml:space="preserve"> </w:t>
+      </w:r>
+      <w:r>
         <w:t xml:space="preserve">Haebom Data Inc., #904, Gasan A1 Tower, 205-27 Gasan 1-ro, Geumcheon-gu, Seoul 08503, Republic of Korea; tysong@haebomdata.com (T.S.); mirinae@haebomdata.com (M.K.)</w:t>
-      </w:r>
-      <w:r>
-        <w:br/>
-      </w:r>
-      <w:r>
-        <w:rPr>
-          <w:vertAlign w:val="superscript"/>
-        </w:rPr>
-        <w:t xml:space="preserve">2</w:t>
-      </w:r>
-      <w:r>
-        <w:t xml:space="preserve"> </w:t>
-      </w:r>
-      <w:r>
-        <w:t xml:space="preserve">Department of Ocean Sciences, Inha University, Incheon 22212, Republic of Korea</w:t>
       </w:r>
       <w:r>
         <w:br/>

</xml_diff>

<commit_message>
Move AI-use declaration before Acknowledgments (MDPI order)
The official MDPI 2024 template orders the back matter Data Availability ->
Use of AI -> Acknowledgments -> Conflicts of Interest. Our AI declaration
sat after Acknowledgments; moved it to right after Data Availability, ahead
of Acknowledgments, to match. Regenerated draft_mdpi.md and rebuilt all four
artifacts; verified AI < Acknowledgments < Conflicts in every output.

Co-Authored-By: Claude Opus 4.8 (1M context) <noreply@anthropic.com>
</commit_message>
<xml_diff>
--- a/manuscript/draft_mdpi.docx
+++ b/manuscript/draft_mdpi.docx
@@ -17133,12 +17133,54 @@
       </w:r>
     </w:p>
     <w:bookmarkEnd w:id="72"/>
-    <w:bookmarkStart w:id="73" w:name="acknowledgments"/>
+    <w:bookmarkStart w:id="73" w:name="X071796dd6bc546c91e96cca1cf5ff96599de61f"/>
     <w:p>
       <w:pPr>
         <w:pStyle w:val="Heading2"/>
       </w:pPr>
       <w:r>
+        <w:t xml:space="preserve">Declaration of Generative AI and AI-Assisted Technologies in the Writing Process</w:t>
+      </w:r>
+    </w:p>
+    <w:p>
+      <w:pPr>
+        <w:pStyle w:val="FirstParagraph"/>
+      </w:pPr>
+      <w:r>
+        <w:t xml:space="preserve">During the preparation of this manuscript, the authors used Claude (Anthropic) to</w:t>
+      </w:r>
+      <w:r>
+        <w:t xml:space="preserve"> </w:t>
+      </w:r>
+      <w:r>
+        <w:t xml:space="preserve">assist with formatting the manuscript to the journal template, condensing the</w:t>
+      </w:r>
+      <w:r>
+        <w:t xml:space="preserve"> </w:t>
+      </w:r>
+      <w:r>
+        <w:t xml:space="preserve">abstract, and language editing. After using this tool, the authors reviewed and</w:t>
+      </w:r>
+      <w:r>
+        <w:t xml:space="preserve"> </w:t>
+      </w:r>
+      <w:r>
+        <w:t xml:space="preserve">edited the content as needed and take full responsibility for the content of the</w:t>
+      </w:r>
+      <w:r>
+        <w:t xml:space="preserve"> </w:t>
+      </w:r>
+      <w:r>
+        <w:t xml:space="preserve">publication.</w:t>
+      </w:r>
+    </w:p>
+    <w:bookmarkEnd w:id="73"/>
+    <w:bookmarkStart w:id="74" w:name="acknowledgments"/>
+    <w:p>
+      <w:pPr>
+        <w:pStyle w:val="Heading2"/>
+      </w:pPr>
+      <w:r>
         <w:t xml:space="preserve">Acknowledgments</w:t>
       </w:r>
     </w:p>
@@ -17160,48 +17202,6 @@
       </w:r>
       <w:r>
         <w:t xml:space="preserve">developers of pyTMD, Cartopy, UTide, and eo-tides for open-source tooling.</w:t>
-      </w:r>
-    </w:p>
-    <w:bookmarkEnd w:id="73"/>
-    <w:bookmarkStart w:id="74" w:name="X071796dd6bc546c91e96cca1cf5ff96599de61f"/>
-    <w:p>
-      <w:pPr>
-        <w:pStyle w:val="Heading2"/>
-      </w:pPr>
-      <w:r>
-        <w:t xml:space="preserve">Declaration of Generative AI and AI-Assisted Technologies in the Writing Process</w:t>
-      </w:r>
-    </w:p>
-    <w:p>
-      <w:pPr>
-        <w:pStyle w:val="FirstParagraph"/>
-      </w:pPr>
-      <w:r>
-        <w:t xml:space="preserve">During the preparation of this manuscript, the authors used Claude (Anthropic) to</w:t>
-      </w:r>
-      <w:r>
-        <w:t xml:space="preserve"> </w:t>
-      </w:r>
-      <w:r>
-        <w:t xml:space="preserve">assist with formatting the manuscript to the journal template, condensing the</w:t>
-      </w:r>
-      <w:r>
-        <w:t xml:space="preserve"> </w:t>
-      </w:r>
-      <w:r>
-        <w:t xml:space="preserve">abstract, and language editing. After using this tool, the authors reviewed and</w:t>
-      </w:r>
-      <w:r>
-        <w:t xml:space="preserve"> </w:t>
-      </w:r>
-      <w:r>
-        <w:t xml:space="preserve">edited the content as needed and take full responsibility for the content of the</w:t>
-      </w:r>
-      <w:r>
-        <w:t xml:space="preserve"> </w:t>
-      </w:r>
-      <w:r>
-        <w:t xml:space="preserve">publication.</w:t>
       </w:r>
     </w:p>
     <w:bookmarkEnd w:id="74"/>

</xml_diff>

<commit_message>
AI declaration: MDPI heading + make it unnumbered
Two fixes to the generative-AI disclosure:
1. Retitle "Declaration of Generative AI and AI-Assisted Technologies in
   the Writing Process" (Elsevier-style) to "Use of Artificial Intelligence"
   — the exact heading MDPI's class prints (mdpi.cls \useofartificialintelligence).
2. It was the only back-matter section still auto-numbered in the LaTeX
   build, showing as a stray "7." between the unnumbered Data Availability
   and Acknowledgments. Added it to the build's UNNUMBERED set so it renders
   \section* like the other back-matter sections.

Regenerated and rebuilt all four artifacts; verified the AI section is
unnumbered and sits Data Availability -> Use of AI -> Acknowledgments.

Co-Authored-By: Claude Opus 4.8 (1M context) <noreply@anthropic.com>
</commit_message>
<xml_diff>
--- a/manuscript/draft_mdpi.docx
+++ b/manuscript/draft_mdpi.docx
@@ -17133,13 +17133,13 @@
       </w:r>
     </w:p>
     <w:bookmarkEnd w:id="72"/>
-    <w:bookmarkStart w:id="73" w:name="X071796dd6bc546c91e96cca1cf5ff96599de61f"/>
+    <w:bookmarkStart w:id="73" w:name="use-of-artificial-intelligence"/>
     <w:p>
       <w:pPr>
         <w:pStyle w:val="Heading2"/>
       </w:pPr>
       <w:r>
-        <w:t xml:space="preserve">Declaration of Generative AI and AI-Assisted Technologies in the Writing Process</w:t>
+        <w:t xml:space="preserve">Use of Artificial Intelligence</w:t>
       </w:r>
     </w:p>
     <w:p>

</xml_diff>

<commit_message>
Fix factual error: JJA slope is lowest/below 1, not "closest to 1"
Section 4.4 claimed the summer (JJA) seasonal slope (beta = 0.81) is
"closest to the theoretical 1", but Table S1b shows MAM (1.138, |delta|=0.14)
is closest; JJA (0.81) is the lowest and the only season below 1. Reworded to
state that accurately while keeping the physical reading (weaker spring-neap
covariance in summer). A reviewer cross-checking the table would have caught
this. Rebuilt the four main artifacts and refreshed the submission copies.

Co-Authored-By: Claude Opus 4.8 (1M context) <noreply@anthropic.com>
</commit_message>
<xml_diff>
--- a/manuscript/draft_mdpi.docx
+++ b/manuscript/draft_mdpi.docx
@@ -9983,7 +9983,18 @@
         <w:t xml:space="preserve"> </w:t>
       </w:r>
       <w:r>
-        <w:t xml:space="preserve">0.85–0.98. The summer (JJA) slope is closest to the theoretical 1 (slope = 0.81); MAM has the highest</w:t>
+        <w:t xml:space="preserve">0.85–0.98. The summer (JJA) slope is the lowest and the only season below the leading-order value of 1 (</w:t>
+      </w:r>
+      <m:oMath>
+        <m:r>
+          <m:t>β</m:t>
+        </m:r>
+      </m:oMath>
+      <w:r>
+        <w:t xml:space="preserve"> </w:t>
+      </w:r>
+      <w:r>
+        <w:t xml:space="preserve">= 0.81), consistent with weaker spring–neap covariance in summer; MAM has the highest</w:t>
       </w:r>
       <w:r>
         <w:t xml:space="preserve"> </w:t>

</xml_diff>

<commit_message>
CRediT: add funding acquisition (M.K., PI of the KOEM project)
Mirinae Kim is the PI of the KOEM 2026 National Blue Carbon Monitoring
project (No. R26TA01845857-00) that funds this work, so she is credited
with Funding acquisition; T.S.'s roles (incl. supervision, project
administration) are unchanged. Keeps the manuscript CRediT consistent with
the SuSy contributor-role entry. Rebuilt the four main artifacts; submission
copies refreshed.

Co-Authored-By: Claude Opus 4.8 (1M context) <noreply@anthropic.com>
</commit_message>
<xml_diff>
--- a/manuscript/draft_mdpi.docx
+++ b/manuscript/draft_mdpi.docx
@@ -16862,13 +16862,19 @@
         <w:t xml:space="preserve"> </w:t>
       </w:r>
       <w:r>
-        <w:t xml:space="preserve">M.K.; visualization, T.S.; supervision, T.S.; project administration, T.S. All</w:t>
-      </w:r>
-      <w:r>
-        <w:t xml:space="preserve"> </w:t>
-      </w:r>
-      <w:r>
-        <w:t xml:space="preserve">authors have read and agreed to the published version of the manuscript.</w:t>
+        <w:t xml:space="preserve">M.K.; visualization, T.S.; supervision, T.S.; project administration, T.S.;</w:t>
+      </w:r>
+      <w:r>
+        <w:t xml:space="preserve"> </w:t>
+      </w:r>
+      <w:r>
+        <w:t xml:space="preserve">funding acquisition, M.K. All authors have read and agreed to the published</w:t>
+      </w:r>
+      <w:r>
+        <w:t xml:space="preserve"> </w:t>
+      </w:r>
+      <w:r>
+        <w:t xml:space="preserve">version of the manuscript.</w:t>
       </w:r>
     </w:p>
     <w:bookmarkEnd w:id="68"/>

</xml_diff>

<commit_message>
Data Availability: cite the published Zenodo DOI (10.5281/zenodo.20797099)
Replace "Zenodo-archived ... upon acceptance (DOI to be assigned)" with the live
record across draft_mdpi.md, draft.md, jmse.tex, README, and CITATION.cff; drop
the internal-filename sentence. Rebuilt draft_mdpi.{pdf,docx} and jmse.pdf.

Co-Authored-By: Claude Opus 4.8 (1M context) <noreply@anthropic.com>
</commit_message>
<xml_diff>
--- a/manuscript/draft_mdpi.docx
+++ b/manuscript/draft_mdpi.docx
@@ -16956,55 +16956,19 @@
         <w:t xml:space="preserve"> </w:t>
       </w:r>
       <w:r>
-        <w:t xml:space="preserve">LANDSAT/LC09/C02/T1_L2, and COPERNICUS/S2_HARMONIZED. The full analytical</w:t>
-      </w:r>
-      <w:r>
-        <w:t xml:space="preserve"> </w:t>
-      </w:r>
-      <w:r>
-        <w:t xml:space="preserve">pipeline, derived parquet/CSV tables, and figure-generation scripts will be</w:t>
-      </w:r>
-      <w:r>
-        <w:t xml:space="preserve"> </w:t>
-      </w:r>
-      <w:r>
-        <w:t xml:space="preserve">released on a Zenodo-archived GitHub repository upon acceptance (DOI to be</w:t>
-      </w:r>
-      <w:r>
-        <w:t xml:space="preserve"> </w:t>
-      </w:r>
-      <w:r>
-        <w:t xml:space="preserve">assigned). The intermediate</w:t>
-      </w:r>
-      <w:r>
-        <w:t xml:space="preserve"> </w:t>
-      </w:r>
-      <w:r>
-        <w:rPr>
-          <w:rStyle w:val="VerbatimChar"/>
-        </w:rPr>
-        <w:t xml:space="preserve">multisite_5y_*.parquet</w:t>
-      </w:r>
-      <w:r>
-        <w:t xml:space="preserve"> </w:t>
-      </w:r>
-      <w:r>
-        <w:t xml:space="preserve">and</w:t>
-      </w:r>
-      <w:r>
-        <w:t xml:space="preserve"> </w:t>
-      </w:r>
-      <w:r>
-        <w:rPr>
-          <w:rStyle w:val="VerbatimChar"/>
-        </w:rPr>
-        <w:t xml:space="preserve">dem_error_*.csv</w:t>
-      </w:r>
-      <w:r>
-        <w:t xml:space="preserve"> </w:t>
-      </w:r>
-      <w:r>
-        <w:t xml:space="preserve">derived products are &lt; 50 MB total.</w:t>
+        <w:t xml:space="preserve">LANDSAT/LC09/C02/T1_L2, and COPERNICUS/S2_HARMONIZED. The derived</w:t>
+      </w:r>
+      <w:r>
+        <w:t xml:space="preserve"> </w:t>
+      </w:r>
+      <w:r>
+        <w:t xml:space="preserve">tables, analytical pipeline, and figure-generation scripts are openly</w:t>
+      </w:r>
+      <w:r>
+        <w:t xml:space="preserve"> </w:t>
+      </w:r>
+      <w:r>
+        <w:t xml:space="preserve">available in Zenodo at https://doi.org/10.5281/zenodo.20797099.</w:t>
       </w:r>
     </w:p>
     <w:bookmarkEnd w:id="71"/>

</xml_diff>